<commit_message>
Senza portafoglio sparisce anche il banco
Il POS con QR e "Paga al banco" sono un pagamento dal wallet: dove si paga
alla cassa non hanno senso. Le 14 rotte /banco* (3 del cliente, 11 dello
staff) portano @wallet_required, la voce Banco della sidebar e il pulsante
"Paga al Banco" della home compaiono solo col portafoglio attivo. Guide
(cliente, utente) e manuale del gestore aggiornati.

Co-Authored-By: Claude Opus 5 <noreply@anthropic.com>
</commit_message>
<xml_diff>
--- a/docs/manuali/guida_cliente.docx
+++ b/docs/manuali/guida_cliente.docx
@@ -10300,6 +10300,73 @@
         </w:rPr>
         <w:t>Paga al Banco — Pagamento QR</w:t>
       </w:r>
+    </w:p>
+    <w:tbl>
+      <w:tblPr>
+        <w:tblLook w:firstColumn="1" w:firstRow="1" w:lastColumn="0" w:lastRow="0" w:noHBand="0" w:noVBand="1" w:val="04A0"/>
+        <w:tblBorders>
+          <w:top w:val="nil"/>
+          <w:left w:val="nil"/>
+          <w:bottom w:val="nil"/>
+          <w:right w:val="nil"/>
+          <w:insideH w:val="nil"/>
+          <w:insideV w:val="nil"/>
+        </w:tblBorders>
+        <w:tblW w:w="6929" w:type="dxa"/>
+      </w:tblPr>
+      <w:tblGrid>
+        <w:gridCol w:w="9412"/>
+      </w:tblGrid>
+      <w:tr>
+        <w:tc>
+          <w:tcPr>
+            <w:tcW w:type="dxa" w:w="9412"/>
+            <w:shd w:val="clear" w:color="auto" w:fill="F5F5F5"/>
+            <w:tcBorders>
+              <w:top w:val="single" w:sz="14" w:color="E8E8E8" w:space="0"/>
+              <w:bottom w:val="single" w:sz="14" w:color="E8E8E8" w:space="0"/>
+              <w:left w:val="single" w:sz="14" w:color="E94560" w:space="0"/>
+              <w:right w:val="single" w:sz="14" w:color="E8E8E8" w:space="0"/>
+            </w:tcBorders>
+            <w:tcMar>
+              <w:top w:w="70" w:type="dxa"/>
+              <w:bottom w:w="70" w:type="dxa"/>
+              <w:left w:w="130" w:type="dxa"/>
+              <w:right w:w="90" w:type="dxa"/>
+            </w:tcMar>
+          </w:tcPr>
+          <w:p>
+            <w:pPr>
+              <w:spacing w:before="0" w:after="0"/>
+            </w:pPr>
+            <w:r>
+              <w:rPr>
+                <w:rFonts w:ascii="PT Sans Narrow" w:hAnsi="PT Sans Narrow" w:cs="PT Sans Narrow" w:eastAsia="PT Sans Narrow"/>
+                <w:b w:val="0"/>
+                <w:i w:val="0"/>
+                <w:color w:val="E94560"/>
+                <w:sz w:val="26"/>
+              </w:rPr>
+              <w:t xml:space="preserve">ℹ️  </w:t>
+            </w:r>
+            <w:r>
+              <w:rPr>
+                <w:rFonts w:ascii="PT Sans Narrow" w:hAnsi="PT Sans Narrow" w:cs="PT Sans Narrow" w:eastAsia="PT Sans Narrow"/>
+                <w:b w:val="0"/>
+                <w:i w:val="0"/>
+                <w:color w:val="343A40"/>
+                <w:sz w:val="26"/>
+              </w:rPr>
+              <w:t>Questa funzione esiste solo nei locali con il portafoglio prepagato attivo: dove si paga alla cassa non compare, e il conto al banco si salda come in qualunque bar.</w:t>
+            </w:r>
+          </w:p>
+        </w:tc>
+      </w:tr>
+    </w:tbl>
+    <w:p>
+      <w:pPr>
+        <w:spacing w:before="0" w:after="120"/>
+      </w:pPr>
     </w:p>
     <w:tbl>
       <w:tblPr>

</xml_diff>